<commit_message>
feat: add Raspberry Pi boot service with environment credentials
</commit_message>
<xml_diff>
--- a/docs/라즈베리파이_웹캠_MCP_매뉴얼.docx
+++ b/docs/라즈베리파이_웹캠_MCP_매뉴얼.docx
@@ -14,7 +14,65 @@
     </w:p>
     <w:p>
       <w:r>
-        <w:t>문서 버전 1.0 · 2026년 9월 29일 · Raspberry Pi OS 64비트용</w:t>
+        <w:t>문서 버전 1.1 · 2026년 9월 29일 · Raspberry Pi OS 64비트용</w:t>
+      </w:r>
+    </w:p>
+    <w:p>
+      <w:r>
+        <w:t>Git으로 내려받는 경우 라즈베리파이에서 다음 명령을 사용합니다. 이후 아래 매뉴얼의 ZIP 압축 해제 단계는 생략합니다.</w:t>
+      </w:r>
+    </w:p>
+    <w:p>
+      <w:pPr>
+        <w:spacing w:after="40"/>
+      </w:pPr>
+      <w:r>
+        <w:rPr>
+          <w:rFonts w:ascii="Consolas" w:hAnsi="Consolas"/>
+          <w:sz w:val="18"/>
+        </w:rPr>
+        <w:t>git clone https://github.com/minato675/ssafy207.git</w:t>
+      </w:r>
+    </w:p>
+    <w:p>
+      <w:pPr>
+        <w:spacing w:after="40"/>
+      </w:pPr>
+      <w:r>
+        <w:rPr>
+          <w:rFonts w:ascii="Consolas" w:hAnsi="Consolas"/>
+          <w:sz w:val="18"/>
+        </w:rPr>
+        <w:t>cd ssafy207</w:t>
+      </w:r>
+    </w:p>
+    <w:p>
+      <w:pPr>
+        <w:spacing w:after="40"/>
+      </w:pPr>
+      <w:r>
+        <w:rPr>
+          <w:rFonts w:ascii="Consolas" w:hAnsi="Consolas"/>
+          <w:sz w:val="18"/>
+        </w:rPr>
+        <w:t>bash setup.sh usb</w:t>
+      </w:r>
+    </w:p>
+    <w:p>
+      <w:pPr>
+        <w:spacing w:after="40"/>
+      </w:pPr>
+      <w:r>
+        <w:rPr>
+          <w:rFonts w:ascii="Consolas" w:hAnsi="Consolas"/>
+          <w:sz w:val="18"/>
+        </w:rPr>
+        <w:t>bash connect-chatgpt.sh usb</w:t>
+      </w:r>
+    </w:p>
+    <w:p>
+      <w:r>
+        <w:t>[PDF 매뉴얼](docs/라즈베리파이_웹캠_MCP_매뉴얼.pdf) · [수정용 Word](docs/라즈베리파이_웹캠_MCP_매뉴얼.docx)</w:t>
       </w:r>
     </w:p>
     <w:p>
@@ -98,7 +156,7 @@
         <w:pStyle w:val="ListBullet"/>
       </w:pPr>
       <w:r>
-        <w:t>GUI 없이 SSH 터미널에서도 실행할 수 있습니다. SSH 연결이 끊어져 프로그램이 종료되면 촬영할 수 없습니다.</w:t>
+        <w:t>GUI 없이 SSH 터미널에서도 실행할 수 있습니다. 수동 실행은 터미널을 유지하며, 8장의 자동 시작 서비스를 설치하면 로그인이나 SSH 연결 없이 실행됩니다.</w:t>
       </w:r>
     </w:p>
     <w:p>
@@ -121,7 +179,7 @@
     </w:p>
     <w:p>
       <w:r>
-        <w:t>webcam-mcp-raspberrypi-v1.0.zip을 라즈베리파이 홈 폴더에 복사합니다. USB 메모리 또는 SCP를 사용할 수 있습니다. 아래 SCP 예시에서 계정과 주소는 자신의 환경으로 바꿉니다.</w:t>
+        <w:t>webcam-mcp-raspberrypi-v1.1.zip을 라즈베리파이 홈 폴더에 복사합니다. USB 메모리 또는 SCP를 사용할 수 있습니다. 아래 SCP 예시에서 계정과 주소는 자신의 환경으로 바꿉니다.</w:t>
       </w:r>
     </w:p>
     <w:p>
@@ -133,7 +191,7 @@
           <w:rFonts w:ascii="Consolas" w:hAnsi="Consolas"/>
           <w:sz w:val="18"/>
         </w:rPr>
-        <w:t>scp .\webcam-mcp-raspberrypi-v1.0.zip 사용자명@라즈베리파이주소:~/</w:t>
+        <w:t>scp .\webcam-mcp-raspberrypi-v1.1.zip 사용자명@라즈베리파이주소:~/</w:t>
       </w:r>
     </w:p>
     <w:p>
@@ -174,7 +232,7 @@
           <w:rFonts w:ascii="Consolas" w:hAnsi="Consolas"/>
           <w:sz w:val="18"/>
         </w:rPr>
-        <w:t>unzip webcam-mcp-raspberrypi-v1.0.zip</w:t>
+        <w:t>unzip webcam-mcp-raspberrypi-v1.1.zip</w:t>
       </w:r>
     </w:p>
     <w:p>
@@ -714,12 +772,12 @@
     </w:p>
     <w:p>
       <w:r>
-        <w:t>ready 응답이 정상입니다. Tunnel started 문구만으로 원격 연결 성공을 단정하지 말고 readyz와 ChatGPT 도구 호출까지 확인합니다. 키는 터널 프로세스 환경으로만 전달하고 파일이나 명령행 인수에 저장하지 않습니다. 카메라 MCP와 촬영 작업에는 키를 전달하지 않습니다.</w:t>
+        <w:t>ready 응답이 정상입니다. Tunnel started 문구만으로 원격 연결 성공을 단정하지 말고 readyz와 ChatGPT 도구 호출까지 확인합니다. 수동 실행은 입력한 키를 파일이나 명령행 인수에 저장하지 않습니다. 카메라 MCP와 촬영 작업에는 키를 전달하지 않습니다.</w:t>
       </w:r>
     </w:p>
     <w:p>
       <w:r>
-        <w:t>실행 중 생성되는 profiles/터널ID/webcam.yaml에는 터널 설정이 들어갑니다. 키는 매번 입력합니다. 이 버전은 자동 시작 서비스나 평문 키 파일을 만들지 않습니다.</w:t>
+        <w:t>실행 중 생성되는 profiles/터널ID/webcam.yaml에는 터널 설정이 들어갑니다. 수동 실행은 키를 매번 입력합니다. 입력 없이 부팅 시 연결하려면 8장의 서비스를 설치합니다.</w:t>
       </w:r>
     </w:p>
     <w:p>
@@ -899,7 +957,348 @@
         <w:pStyle w:val="Heading1"/>
       </w:pPr>
       <w:r>
-        <w:t>8 종료와 다시 실행</w:t>
+        <w:t>8 전원을 켜면 자동 연결하기</w:t>
+      </w:r>
+    </w:p>
+    <w:p>
+      <w:r>
+        <w:t>처음 한 번 터널과 ChatGPT 앱을 등록하고 키를 환경 파일에 저장합니다. 이후 부팅하면 systemd가 환경 파일을 읽고 MCP와 터널을 실행합니다. 로그인하거나 키를 다시 입력할 필요가 없습니다. 부팅 자체로 사진을 찍지는 않으며, GPT에서 capture_photo를 요청할 때만 촬영합니다.</w:t>
+      </w:r>
+    </w:p>
+    <w:p>
+      <w:r>
+        <w:t>먼저 setup.sh 설치를 마치고, 수동 실행 중인 run-local.sh 또는 connect-chatgpt.sh는 Ctrl+C로 종료합니다. 설치 폴더는 일반 사용자 소유의 홈 폴더 아래에 두고 경로에 공백이나 한글을 넣지 않습니다. 예: /home/사용자명/ssafy207에서 사용자명은 실제 영문 계정명입니다.</w:t>
+      </w:r>
+    </w:p>
+    <w:p>
+      <w:r>
+        <w:t>일반 사용자 터미널에서 저장소 폴더로 이동한 뒤 실행합니다.</w:t>
+      </w:r>
+    </w:p>
+    <w:p>
+      <w:pPr>
+        <w:spacing w:after="40"/>
+      </w:pPr>
+      <w:r>
+        <w:rPr>
+          <w:rFonts w:ascii="Consolas" w:hAnsi="Consolas"/>
+          <w:sz w:val="18"/>
+        </w:rPr>
+        <w:t>git pull</w:t>
+      </w:r>
+    </w:p>
+    <w:p>
+      <w:pPr>
+        <w:spacing w:after="40"/>
+      </w:pPr>
+      <w:r>
+        <w:rPr>
+          <w:rFonts w:ascii="Consolas" w:hAnsi="Consolas"/>
+          <w:sz w:val="18"/>
+        </w:rPr>
+        <w:t>sudo bash install-service.sh</w:t>
+      </w:r>
+    </w:p>
+    <w:p>
+      <w:r>
+        <w:t>첫 실행은 /etc/raspberrypi-camera.env에 템플릿을 만들고 종료 코드 1로 멈춥니다. 키를 먼저 채우라는 정상 안내입니다. 기존 환경 파일은 덮어쓰지 않습니다. 다음 명령으로 파일을 엽니다.</w:t>
+      </w:r>
+    </w:p>
+    <w:p>
+      <w:pPr>
+        <w:spacing w:after="40"/>
+      </w:pPr>
+      <w:r>
+        <w:rPr>
+          <w:rFonts w:ascii="Consolas" w:hAnsi="Consolas"/>
+          <w:sz w:val="18"/>
+        </w:rPr>
+        <w:t>sudo nano /etc/raspberrypi-camera.env</w:t>
+      </w:r>
+    </w:p>
+    <w:p>
+      <w:r>
+        <w:t>아래 두 예시 값을 본인의 터널 ID와 API 키로 바꿉니다. export를 붙이지 않으며, 셸 명령이나 변수 참조를 넣지 않습니다.</w:t>
+      </w:r>
+    </w:p>
+    <w:p>
+      <w:pPr>
+        <w:spacing w:after="40"/>
+      </w:pPr>
+      <w:r>
+        <w:rPr>
+          <w:rFonts w:ascii="Consolas" w:hAnsi="Consolas"/>
+          <w:sz w:val="18"/>
+        </w:rPr>
+        <w:t>TUNNEL_ID=tunnel_REPLACE_ME</w:t>
+      </w:r>
+    </w:p>
+    <w:p>
+      <w:pPr>
+        <w:spacing w:after="40"/>
+      </w:pPr>
+      <w:r>
+        <w:rPr>
+          <w:rFonts w:ascii="Consolas" w:hAnsi="Consolas"/>
+          <w:sz w:val="18"/>
+        </w:rPr>
+        <w:t>CONTROL_PLANE_API_KEY=REPLACE_ME</w:t>
+      </w:r>
+    </w:p>
+    <w:p>
+      <w:pPr>
+        <w:spacing w:after="40"/>
+      </w:pPr>
+      <w:r>
+        <w:rPr>
+          <w:rFonts w:ascii="Consolas" w:hAnsi="Consolas"/>
+          <w:sz w:val="18"/>
+        </w:rPr>
+        <w:t>CAMERA_BACKEND=usb</w:t>
+      </w:r>
+    </w:p>
+    <w:p>
+      <w:r>
+        <w:t>nano에서 Ctrl+O, Enter로 저장하고 Ctrl+X로 종료한 뒤 설치기를 다시 실행합니다.</w:t>
+      </w:r>
+    </w:p>
+    <w:p>
+      <w:pPr>
+        <w:spacing w:after="40"/>
+      </w:pPr>
+      <w:r>
+        <w:rPr>
+          <w:rFonts w:ascii="Consolas" w:hAnsi="Consolas"/>
+          <w:sz w:val="18"/>
+        </w:rPr>
+        <w:t>sudo bash install-service.sh</w:t>
+      </w:r>
+    </w:p>
+    <w:p>
+      <w:pPr>
+        <w:spacing w:after="40"/>
+      </w:pPr>
+      <w:r>
+        <w:rPr>
+          <w:rFonts w:ascii="Consolas" w:hAnsi="Consolas"/>
+          <w:sz w:val="18"/>
+        </w:rPr>
+        <w:t>systemctl is-enabled raspberrypi-camera.service</w:t>
+      </w:r>
+    </w:p>
+    <w:p>
+      <w:pPr>
+        <w:spacing w:after="40"/>
+      </w:pPr>
+      <w:r>
+        <w:rPr>
+          <w:rFonts w:ascii="Consolas" w:hAnsi="Consolas"/>
+          <w:sz w:val="18"/>
+        </w:rPr>
+        <w:t>systemctl status raspberrypi-camera.service --no-pager</w:t>
+      </w:r>
+    </w:p>
+    <w:p>
+      <w:pPr>
+        <w:spacing w:after="40"/>
+      </w:pPr>
+      <w:r>
+        <w:rPr>
+          <w:rFonts w:ascii="Consolas" w:hAnsi="Consolas"/>
+          <w:sz w:val="18"/>
+        </w:rPr>
+        <w:t>curl http://127.0.0.1:18765/readyz</w:t>
+      </w:r>
+    </w:p>
+    <w:p>
+      <w:r>
+        <w:t>enabled는 부팅 시 실행 등록을 의미합니다. active만으로 터널 연결까지 성공했다고 판단하지 말고 readyz와 GPT 호출을 확인합니다. 환경 파일은 root:root, 권한 600으로 제한된 평문 파일입니다. 서비스는 일반 사용자로 실행되며 카메라 접근용 video 그룹을 추가로 사용합니다. 키는 실행기와 터널에만 전달되고 카메라 프로세스에는 전달하지 않습니다. 환경 파일은 Git에 올리지 않습니다.</w:t>
+      </w:r>
+    </w:p>
+    <w:p>
+      <w:r>
+        <w:br w:type="page"/>
+      </w:r>
+    </w:p>
+    <w:p>
+      <w:pPr>
+        <w:pStyle w:val="Heading1"/>
+      </w:pPr>
+      <w:r>
+        <w:t>9 자동 시작 확인과 관리</w:t>
+      </w:r>
+    </w:p>
+    <w:p>
+      <w:r>
+        <w:t>저장할 작업을 마친 후 재부팅합니다. SSH는 끊어집니다.</w:t>
+      </w:r>
+    </w:p>
+    <w:p>
+      <w:pPr>
+        <w:spacing w:after="40"/>
+      </w:pPr>
+      <w:r>
+        <w:rPr>
+          <w:rFonts w:ascii="Consolas" w:hAnsi="Consolas"/>
+          <w:sz w:val="18"/>
+        </w:rPr>
+        <w:t>sudo reboot</w:t>
+      </w:r>
+    </w:p>
+    <w:p>
+      <w:r>
+        <w:t>부팅 후 다시 접속하여 상태를 확인합니다. SSH 접속은 확인용이며 서비스 실행 조건이 아닙니다.</w:t>
+      </w:r>
+    </w:p>
+    <w:p>
+      <w:pPr>
+        <w:spacing w:after="40"/>
+      </w:pPr>
+      <w:r>
+        <w:rPr>
+          <w:rFonts w:ascii="Consolas" w:hAnsi="Consolas"/>
+          <w:sz w:val="18"/>
+        </w:rPr>
+        <w:t>systemctl status raspberrypi-camera.service --no-pager</w:t>
+      </w:r>
+    </w:p>
+    <w:p>
+      <w:pPr>
+        <w:spacing w:after="40"/>
+      </w:pPr>
+      <w:r>
+        <w:rPr>
+          <w:rFonts w:ascii="Consolas" w:hAnsi="Consolas"/>
+          <w:sz w:val="18"/>
+        </w:rPr>
+        <w:t>curl http://127.0.0.1:18765/readyz</w:t>
+      </w:r>
+    </w:p>
+    <w:p>
+      <w:pPr>
+        <w:spacing w:after="40"/>
+      </w:pPr>
+      <w:r>
+        <w:rPr>
+          <w:rFonts w:ascii="Consolas" w:hAnsi="Consolas"/>
+          <w:sz w:val="18"/>
+        </w:rPr>
+        <w:t>sudo journalctl -u raspberrypi-camera.service -b -n 50 --no-pager</w:t>
+      </w:r>
+    </w:p>
+    <w:p>
+      <w:r>
+        <w:t>GPT에서 camera_status를 호출하고, 이어 capture_photo로 사진 한 장을 요청합니다. 재부팅 후 키 입력 없이 사진이 반환되면 자동 시작 검증이 완료됩니다. 처음 터널 연결에는 시간이 걸릴 수 있습니다. 연결 실패로 프로세스가 종료되면 15초 후 다시 실행합니다. 인터넷과 유효한 API 키는 계속 필요하며, 만료된 키를 자동 발급하지는 않습니다.</w:t>
+      </w:r>
+    </w:p>
+    <w:p>
+      <w:r>
+        <w:t>키를 교체하거나 터널 ID를 변경할 때:</w:t>
+      </w:r>
+    </w:p>
+    <w:p>
+      <w:pPr>
+        <w:spacing w:after="40"/>
+      </w:pPr>
+      <w:r>
+        <w:rPr>
+          <w:rFonts w:ascii="Consolas" w:hAnsi="Consolas"/>
+          <w:sz w:val="18"/>
+        </w:rPr>
+        <w:t>sudo nano /etc/raspberrypi-camera.env</w:t>
+      </w:r>
+    </w:p>
+    <w:p>
+      <w:pPr>
+        <w:spacing w:after="40"/>
+      </w:pPr>
+      <w:r>
+        <w:rPr>
+          <w:rFonts w:ascii="Consolas" w:hAnsi="Consolas"/>
+          <w:sz w:val="18"/>
+        </w:rPr>
+        <w:t>sudo systemctl restart raspberrypi-camera.service</w:t>
+      </w:r>
+    </w:p>
+    <w:p>
+      <w:r>
+        <w:t>터널 ID를 변경했다면 ChatGPT 앱도 해당 터널에 연결합니다. 같은 ID와 앱을 유지하면 재부팅 때마다 앱을 다시 만들 필요는 없습니다.</w:t>
+      </w:r>
+    </w:p>
+    <w:p>
+      <w:r>
+        <w:t>잠시 중지 / 다시 시작:</w:t>
+      </w:r>
+    </w:p>
+    <w:p>
+      <w:pPr>
+        <w:spacing w:after="40"/>
+      </w:pPr>
+      <w:r>
+        <w:rPr>
+          <w:rFonts w:ascii="Consolas" w:hAnsi="Consolas"/>
+          <w:sz w:val="18"/>
+        </w:rPr>
+        <w:t>sudo systemctl stop raspberrypi-camera.service</w:t>
+      </w:r>
+    </w:p>
+    <w:p>
+      <w:pPr>
+        <w:spacing w:after="40"/>
+      </w:pPr>
+      <w:r>
+        <w:rPr>
+          <w:rFonts w:ascii="Consolas" w:hAnsi="Consolas"/>
+          <w:sz w:val="18"/>
+        </w:rPr>
+        <w:t>sudo systemctl start raspberrypi-camera.service</w:t>
+      </w:r>
+    </w:p>
+    <w:p>
+      <w:r>
+        <w:t>부팅 시 자동 시작까지 해제 / 다시 활성화:</w:t>
+      </w:r>
+    </w:p>
+    <w:p>
+      <w:pPr>
+        <w:spacing w:after="40"/>
+      </w:pPr>
+      <w:r>
+        <w:rPr>
+          <w:rFonts w:ascii="Consolas" w:hAnsi="Consolas"/>
+          <w:sz w:val="18"/>
+        </w:rPr>
+        <w:t>sudo systemctl disable --now raspberrypi-camera.service</w:t>
+      </w:r>
+    </w:p>
+    <w:p>
+      <w:pPr>
+        <w:spacing w:after="40"/>
+      </w:pPr>
+      <w:r>
+        <w:rPr>
+          <w:rFonts w:ascii="Consolas" w:hAnsi="Consolas"/>
+          <w:sz w:val="18"/>
+        </w:rPr>
+        <w:t>sudo systemctl enable --now raspberrypi-camera.service</w:t>
+      </w:r>
+    </w:p>
+    <w:p>
+      <w:r>
+        <w:t>서비스 사용 중에는 수동 연결 실행기를 함께 켜지 않습니다. 설치 폴더를 옮기면 서비스를 먼저 중지한 뒤 새 폴더에서 설치기를 다시 실행합니다. Git으로 업데이트한 뒤에는 서비스를 재시작합니다. 실제 라즈베리파이의 부팅·카메라·원격 호출 검증은 장치에서 수행해야 합니다.</w:t>
+      </w:r>
+    </w:p>
+    <w:p>
+      <w:r>
+        <w:br w:type="page"/>
+      </w:r>
+    </w:p>
+    <w:p>
+      <w:pPr>
+        <w:pStyle w:val="Heading1"/>
+      </w:pPr>
+      <w:r>
+        <w:t>10 수동 실행 종료와 다시 실행</w:t>
       </w:r>
     </w:p>
     <w:p>
@@ -922,7 +1321,7 @@
         <w:pStyle w:val="Heading1"/>
       </w:pPr>
       <w:r>
-        <w:t>9 문제 해결</w:t>
+        <w:t>11 문제 해결</w:t>
       </w:r>
     </w:p>
     <w:p>
@@ -978,7 +1377,15 @@
         <w:pStyle w:val="ListBullet"/>
       </w:pPr>
       <w:r>
-        <w:t>포트 8765 또는 18765 사용 중: 이전 run-local.sh 또는 connect-chatgpt.sh 창에서 Ctrl+C로 종료합니다. 다른 앱은 임의로 종료하지 않습니다.</w:t>
+        <w:t>포트 8765 또는 18765 사용 중: 이전 수동 실행 창에서 Ctrl+C로 종료하거나 systemctl로 기존 서비스를 중지합니다. 다른 앱은 임의로 종료하지 않습니다.</w:t>
+      </w:r>
+    </w:p>
+    <w:p>
+      <w:pPr>
+        <w:pStyle w:val="ListBullet"/>
+      </w:pPr>
+      <w:r>
+        <w:t>서비스가 반복 재시작됨: journalctl에서 오류를 확인합니다. 환경 파일의 예시 값, 키 만료, 인터넷 연결, 포트 점유를 점검한 후 재시작합니다.</w:t>
       </w:r>
     </w:p>
     <w:p>
@@ -1023,7 +1430,7 @@
         <w:pStyle w:val="Heading1"/>
       </w:pPr>
       <w:r>
-        <w:t>10 배포 파일과 검증 기준</w:t>
+        <w:t>12 배포 파일과 검증 기준</w:t>
       </w:r>
     </w:p>
     <w:p>
@@ -1040,6 +1447,14 @@
       </w:pPr>
       <w:r>
         <w:t>connect-chatgpt.sh / connect.py: 숨김 키 입력, 서버·터널 실행과 종료</w:t>
+      </w:r>
+    </w:p>
+    <w:p>
+      <w:pPr>
+        <w:pStyle w:val="ListBullet"/>
+      </w:pPr>
+      <w:r>
+        <w:t>install-service.sh / .env.example: 자동 시작 서비스 설치와 환경 파일 템플릿</w:t>
       </w:r>
     </w:p>
     <w:p>
@@ -1091,6 +1506,14 @@
       </w:r>
     </w:p>
     <w:p>
+      <w:pPr>
+        <w:pStyle w:val="ListBullet"/>
+      </w:pPr>
+      <w:r>
+        <w:t>test_configuration.py: 입력 없는 환경 변수 설정과 누락 값 거절 검사</w:t>
+      </w:r>
+    </w:p>
+    <w:p>
       <w:r>
         <w:t>배포 ZIP에는 개인 API 키, 개인 터널 ID, 촬영 사진, 가상환경, 사용 중인 프로필을 포함하지 않습니다. 사용 후 폴더 전체 대신 최초 배포 ZIP을 전달하세요. 실제 촬영 이미지가 포함되는 GPT 대화는 사용자 계정의 데이터 설정을 따릅니다.</w:t>
       </w:r>
@@ -1110,7 +1533,7 @@
         <w:pStyle w:val="Heading1"/>
       </w:pPr>
       <w:r>
-        <w:t>11 참고 자료</w:t>
+        <w:t>13 참고 자료</w:t>
       </w:r>
     </w:p>
     <w:p>
@@ -1146,6 +1569,21 @@
     <w:p>
       <w:r>
         <w:t>참고 캡처는 2026년 9월 28일 화면이며 메뉴 이름은 계정 및 업데이트에 따라 달라질 수 있습니다.</w:t>
+      </w:r>
+    </w:p>
+    <w:p>
+      <w:r>
+        <w:t>systemd 공식 서비스 및 환경 파일 설정 문서</w:t>
+      </w:r>
+    </w:p>
+    <w:p>
+      <w:r>
+        <w:t>https://github.com/systemd/systemd/blob/main/man/systemd.service.xml</w:t>
+      </w:r>
+    </w:p>
+    <w:p>
+      <w:r>
+        <w:t>https://github.com/systemd/systemd/blob/main/man/systemd.exec.xml</w:t>
       </w:r>
     </w:p>
     <w:sectPr>

</xml_diff>